<commit_message>
random veci poznamky idk
</commit_message>
<xml_diff>
--- a/3.rok_dual/Nemcina/nepravidelne_21.9.docx
+++ b/3.rok_dual/Nemcina/nepravidelne_21.9.docx
@@ -202,6 +202,22 @@
       </w:pPr>
     </w:p>
     <w:p>
+      <w:r>
+        <w:t>TEST:</w:t>
+      </w:r>
+    </w:p>
+    <w:p>
+      <w:r>
+        <w:t>SKLONOVANIE MODALNYCH</w:t>
+      </w:r>
+    </w:p>
+    <w:p>
+      <w:r>
+        <w:t>VETY NA PREKLAD</w:t>
+      </w:r>
+    </w:p>
+    <w:p/>
+    <w:p>
       <w:pPr>
         <w:rPr>
           <w:lang w:val="de-DE"/>
@@ -211,7 +227,55 @@
         <w:rPr>
           <w:lang w:val="de-DE"/>
         </w:rPr>
-        <w:t>TEST:</w:t>
+        <w:t xml:space="preserve">Chcel by </w:t>
+      </w:r>
+      <w:proofErr w:type="spellStart"/>
+      <w:r>
+        <w:rPr>
+          <w:lang w:val="de-DE"/>
+        </w:rPr>
+        <w:t>som</w:t>
+      </w:r>
+      <w:proofErr w:type="spellEnd"/>
+      <w:r>
+        <w:rPr>
+          <w:lang w:val="de-DE"/>
+        </w:rPr>
+        <w:t xml:space="preserve"> </w:t>
+      </w:r>
+      <w:proofErr w:type="spellStart"/>
+      <w:r>
+        <w:rPr>
+          <w:lang w:val="de-DE"/>
+        </w:rPr>
+        <w:t>sa</w:t>
+      </w:r>
+      <w:proofErr w:type="spellEnd"/>
+      <w:r>
+        <w:rPr>
+          <w:lang w:val="de-DE"/>
+        </w:rPr>
+        <w:t xml:space="preserve"> </w:t>
+      </w:r>
+      <w:proofErr w:type="spellStart"/>
+      <w:r>
+        <w:rPr>
+          <w:lang w:val="de-DE"/>
+        </w:rPr>
+        <w:t>opytat</w:t>
+      </w:r>
+      <w:proofErr w:type="spellEnd"/>
+      <w:r>
+        <w:rPr>
+          <w:lang w:val="de-DE"/>
+        </w:rPr>
+        <w:t xml:space="preserve"> – ich m</w:t>
+      </w:r>
+      <w:r>
+        <w:rPr>
+          <w:lang w:val="de-DE"/>
+        </w:rPr>
+        <w:t>öchte fragen.</w:t>
       </w:r>
     </w:p>
     <w:p>
@@ -220,24 +284,481 @@
           <w:lang w:val="de-DE"/>
         </w:rPr>
       </w:pPr>
-      <w:r>
-        <w:rPr>
-          <w:lang w:val="de-DE"/>
-        </w:rPr>
-        <w:t>SKLONOVANIE MODALNYCH</w:t>
+      <w:proofErr w:type="spellStart"/>
+      <w:r>
+        <w:rPr>
+          <w:lang w:val="de-DE"/>
+        </w:rPr>
+        <w:t>Musis</w:t>
+      </w:r>
+      <w:proofErr w:type="spellEnd"/>
+      <w:r>
+        <w:rPr>
+          <w:lang w:val="de-DE"/>
+        </w:rPr>
+        <w:t xml:space="preserve"> mi </w:t>
+      </w:r>
+      <w:proofErr w:type="spellStart"/>
+      <w:r>
+        <w:rPr>
+          <w:lang w:val="de-DE"/>
+        </w:rPr>
+        <w:t>odpovedat</w:t>
+      </w:r>
+      <w:proofErr w:type="spellEnd"/>
+      <w:r>
+        <w:rPr>
+          <w:lang w:val="de-DE"/>
+        </w:rPr>
+        <w:t xml:space="preserve"> – </w:t>
+      </w:r>
+      <w:r>
+        <w:rPr>
+          <w:lang w:val="de-DE"/>
+        </w:rPr>
+        <w:t>Du musst mir antworten.</w:t>
       </w:r>
     </w:p>
     <w:p>
       <w:pPr>
         <w:rPr>
-          <w:lang w:val="de-DE"/>
+          <w:lang w:val="sk-SK"/>
         </w:rPr>
       </w:pPr>
       <w:r>
         <w:rPr>
           <w:lang w:val="de-DE"/>
         </w:rPr>
-        <w:t>VETY NA PREKLAD</w:t>
+        <w:t>Ma</w:t>
+      </w:r>
+      <w:r>
+        <w:rPr>
+          <w:lang w:val="de-DE"/>
+        </w:rPr>
+        <w:t xml:space="preserve">s </w:t>
+      </w:r>
+      <w:proofErr w:type="spellStart"/>
+      <w:r>
+        <w:rPr>
+          <w:lang w:val="de-DE"/>
+        </w:rPr>
+        <w:t>in</w:t>
+      </w:r>
+      <w:r>
+        <w:rPr>
+          <w:lang w:val="de-DE"/>
+        </w:rPr>
+        <w:t>formovat</w:t>
+      </w:r>
+      <w:proofErr w:type="spellEnd"/>
+      <w:r>
+        <w:rPr>
+          <w:lang w:val="de-DE"/>
+        </w:rPr>
+        <w:t xml:space="preserve"> o </w:t>
+      </w:r>
+      <w:proofErr w:type="spellStart"/>
+      <w:r>
+        <w:rPr>
+          <w:lang w:val="de-DE"/>
+        </w:rPr>
+        <w:t>konferencii</w:t>
+      </w:r>
+      <w:proofErr w:type="spellEnd"/>
+      <w:r>
+        <w:rPr>
+          <w:lang w:val="sk-SK"/>
+        </w:rPr>
+        <w:t xml:space="preserve">? </w:t>
+      </w:r>
+      <w:r>
+        <w:rPr>
+          <w:lang w:val="sk-SK"/>
+        </w:rPr>
+        <w:t>–</w:t>
+      </w:r>
+      <w:r>
+        <w:rPr>
+          <w:lang w:val="sk-SK"/>
+        </w:rPr>
+        <w:t xml:space="preserve"> </w:t>
+      </w:r>
+      <w:proofErr w:type="spellStart"/>
+      <w:r>
+        <w:rPr>
+          <w:lang w:val="sk-SK"/>
+        </w:rPr>
+        <w:t>Sollst</w:t>
+      </w:r>
+      <w:proofErr w:type="spellEnd"/>
+      <w:r>
+        <w:rPr>
+          <w:lang w:val="sk-SK"/>
+        </w:rPr>
+        <w:t xml:space="preserve"> </w:t>
+      </w:r>
+      <w:proofErr w:type="spellStart"/>
+      <w:r>
+        <w:rPr>
+          <w:lang w:val="sk-SK"/>
+        </w:rPr>
+        <w:t>du</w:t>
+      </w:r>
+      <w:proofErr w:type="spellEnd"/>
+      <w:r>
+        <w:rPr>
+          <w:lang w:val="sk-SK"/>
+        </w:rPr>
+        <w:t xml:space="preserve"> </w:t>
+      </w:r>
+      <w:proofErr w:type="spellStart"/>
+      <w:r>
+        <w:rPr>
+          <w:lang w:val="sk-SK"/>
+        </w:rPr>
+        <w:t>über</w:t>
+      </w:r>
+      <w:proofErr w:type="spellEnd"/>
+      <w:r>
+        <w:rPr>
+          <w:lang w:val="sk-SK"/>
+        </w:rPr>
+        <w:t xml:space="preserve"> </w:t>
+      </w:r>
+      <w:proofErr w:type="spellStart"/>
+      <w:r>
+        <w:rPr>
+          <w:lang w:val="sk-SK"/>
+        </w:rPr>
+        <w:t>die</w:t>
+      </w:r>
+      <w:proofErr w:type="spellEnd"/>
+      <w:r>
+        <w:rPr>
+          <w:lang w:val="sk-SK"/>
+        </w:rPr>
+        <w:t xml:space="preserve"> </w:t>
+      </w:r>
+      <w:proofErr w:type="spellStart"/>
+      <w:r>
+        <w:rPr>
+          <w:lang w:val="sk-SK"/>
+        </w:rPr>
+        <w:t>konferenz</w:t>
+      </w:r>
+      <w:proofErr w:type="spellEnd"/>
+      <w:r>
+        <w:rPr>
+          <w:lang w:val="sk-SK"/>
+        </w:rPr>
+        <w:t xml:space="preserve"> </w:t>
+      </w:r>
+      <w:proofErr w:type="spellStart"/>
+      <w:r>
+        <w:rPr>
+          <w:lang w:val="sk-SK"/>
+        </w:rPr>
+        <w:t>berichten</w:t>
+      </w:r>
+      <w:proofErr w:type="spellEnd"/>
+      <w:r>
+        <w:rPr>
+          <w:lang w:val="sk-SK"/>
+        </w:rPr>
+        <w:t>?</w:t>
+      </w:r>
+    </w:p>
+    <w:p>
+      <w:pPr>
+        <w:rPr>
+          <w:lang w:val="sk-SK"/>
+        </w:rPr>
+      </w:pPr>
+      <w:r>
+        <w:rPr>
+          <w:lang w:val="sk-SK"/>
+        </w:rPr>
+        <w:t xml:space="preserve">Zajtra </w:t>
+      </w:r>
+      <w:proofErr w:type="spellStart"/>
+      <w:r>
+        <w:rPr>
+          <w:lang w:val="sk-SK"/>
+        </w:rPr>
+        <w:t>musime</w:t>
+      </w:r>
+      <w:proofErr w:type="spellEnd"/>
+      <w:r>
+        <w:rPr>
+          <w:lang w:val="sk-SK"/>
+        </w:rPr>
+        <w:t xml:space="preserve"> </w:t>
+      </w:r>
+      <w:proofErr w:type="spellStart"/>
+      <w:r>
+        <w:rPr>
+          <w:lang w:val="sk-SK"/>
+        </w:rPr>
+        <w:t>ist</w:t>
+      </w:r>
+      <w:proofErr w:type="spellEnd"/>
+      <w:r>
+        <w:rPr>
+          <w:lang w:val="sk-SK"/>
+        </w:rPr>
+        <w:t xml:space="preserve"> do firmy – </w:t>
+      </w:r>
+      <w:proofErr w:type="spellStart"/>
+      <w:r>
+        <w:rPr>
+          <w:lang w:val="sk-SK"/>
+        </w:rPr>
+        <w:t>Morgen</w:t>
+      </w:r>
+      <w:proofErr w:type="spellEnd"/>
+      <w:r>
+        <w:rPr>
+          <w:lang w:val="sk-SK"/>
+        </w:rPr>
+        <w:t xml:space="preserve"> </w:t>
+      </w:r>
+      <w:proofErr w:type="spellStart"/>
+      <w:r>
+        <w:rPr>
+          <w:lang w:val="sk-SK"/>
+        </w:rPr>
+        <w:t>müssen</w:t>
+      </w:r>
+      <w:proofErr w:type="spellEnd"/>
+      <w:r>
+        <w:rPr>
+          <w:lang w:val="sk-SK"/>
+        </w:rPr>
+        <w:t xml:space="preserve"> </w:t>
+      </w:r>
+      <w:proofErr w:type="spellStart"/>
+      <w:r>
+        <w:rPr>
+          <w:lang w:val="sk-SK"/>
+        </w:rPr>
+        <w:t>Wir</w:t>
+      </w:r>
+      <w:proofErr w:type="spellEnd"/>
+      <w:r>
+        <w:rPr>
+          <w:lang w:val="sk-SK"/>
+        </w:rPr>
+        <w:t xml:space="preserve"> in </w:t>
+      </w:r>
+      <w:proofErr w:type="spellStart"/>
+      <w:r>
+        <w:rPr>
+          <w:lang w:val="sk-SK"/>
+        </w:rPr>
+        <w:t>die</w:t>
+      </w:r>
+      <w:proofErr w:type="spellEnd"/>
+      <w:r>
+        <w:rPr>
+          <w:lang w:val="sk-SK"/>
+        </w:rPr>
+        <w:t xml:space="preserve"> Firma </w:t>
+      </w:r>
+      <w:proofErr w:type="spellStart"/>
+      <w:r>
+        <w:rPr>
+          <w:lang w:val="sk-SK"/>
+        </w:rPr>
+        <w:t>gehen</w:t>
+      </w:r>
+      <w:proofErr w:type="spellEnd"/>
+      <w:r>
+        <w:rPr>
+          <w:lang w:val="sk-SK"/>
+        </w:rPr>
+        <w:t>.</w:t>
+      </w:r>
+    </w:p>
+    <w:p>
+      <w:pPr>
+        <w:rPr>
+          <w:color w:val="4EA72E" w:themeColor="accent6"/>
+          <w:lang w:val="sk-SK"/>
+        </w:rPr>
+      </w:pPr>
+      <w:proofErr w:type="spellStart"/>
+      <w:r>
+        <w:rPr>
+          <w:color w:val="4EA72E" w:themeColor="accent6"/>
+          <w:lang w:val="sk-SK"/>
+        </w:rPr>
+        <w:t>Morgen</w:t>
+      </w:r>
+      <w:proofErr w:type="spellEnd"/>
+      <w:r>
+        <w:rPr>
+          <w:color w:val="4EA72E" w:themeColor="accent6"/>
+          <w:lang w:val="sk-SK"/>
+        </w:rPr>
+        <w:t xml:space="preserve"> – zajtra, der </w:t>
+      </w:r>
+      <w:proofErr w:type="spellStart"/>
+      <w:r>
+        <w:rPr>
+          <w:color w:val="4EA72E" w:themeColor="accent6"/>
+          <w:lang w:val="sk-SK"/>
+        </w:rPr>
+        <w:t>Morgen</w:t>
+      </w:r>
+      <w:proofErr w:type="spellEnd"/>
+      <w:r>
+        <w:rPr>
+          <w:color w:val="4EA72E" w:themeColor="accent6"/>
+          <w:lang w:val="sk-SK"/>
+        </w:rPr>
+        <w:t xml:space="preserve"> – </w:t>
+      </w:r>
+      <w:proofErr w:type="spellStart"/>
+      <w:r>
+        <w:rPr>
+          <w:color w:val="4EA72E" w:themeColor="accent6"/>
+          <w:lang w:val="sk-SK"/>
+        </w:rPr>
+        <w:t>rano</w:t>
+      </w:r>
+      <w:proofErr w:type="spellEnd"/>
+      <w:r>
+        <w:rPr>
+          <w:color w:val="4EA72E" w:themeColor="accent6"/>
+          <w:lang w:val="sk-SK"/>
+        </w:rPr>
+        <w:tab/>
+      </w:r>
+      <w:r>
+        <w:rPr>
+          <w:color w:val="4EA72E" w:themeColor="accent6"/>
+          <w:lang w:val="sk-SK"/>
+        </w:rPr>
+        <w:tab/>
+        <w:t xml:space="preserve">zajtra </w:t>
+      </w:r>
+      <w:proofErr w:type="spellStart"/>
+      <w:r>
+        <w:rPr>
+          <w:color w:val="4EA72E" w:themeColor="accent6"/>
+          <w:lang w:val="sk-SK"/>
+        </w:rPr>
+        <w:t>rano</w:t>
+      </w:r>
+      <w:proofErr w:type="spellEnd"/>
+      <w:r>
+        <w:rPr>
+          <w:color w:val="4EA72E" w:themeColor="accent6"/>
+          <w:lang w:val="sk-SK"/>
+        </w:rPr>
+        <w:t xml:space="preserve"> je </w:t>
+      </w:r>
+      <w:proofErr w:type="spellStart"/>
+      <w:r>
+        <w:rPr>
+          <w:color w:val="4EA72E" w:themeColor="accent6"/>
+          <w:lang w:val="sk-SK"/>
+        </w:rPr>
+        <w:t>morgen</w:t>
+      </w:r>
+      <w:proofErr w:type="spellEnd"/>
+      <w:r>
+        <w:rPr>
+          <w:color w:val="4EA72E" w:themeColor="accent6"/>
+          <w:lang w:val="sk-SK"/>
+        </w:rPr>
+        <w:t xml:space="preserve"> </w:t>
+      </w:r>
+      <w:proofErr w:type="spellStart"/>
+      <w:r>
+        <w:rPr>
+          <w:color w:val="4EA72E" w:themeColor="accent6"/>
+          <w:lang w:val="sk-SK"/>
+        </w:rPr>
+        <w:t>früh</w:t>
+      </w:r>
+      <w:proofErr w:type="spellEnd"/>
+    </w:p>
+    <w:p>
+      <w:pPr>
+        <w:rPr>
+          <w:lang w:val="de-DE"/>
+        </w:rPr>
+      </w:pPr>
+      <w:proofErr w:type="spellStart"/>
+      <w:r>
+        <w:rPr>
+          <w:lang w:val="de-DE"/>
+        </w:rPr>
+        <w:t>Ako</w:t>
+      </w:r>
+      <w:proofErr w:type="spellEnd"/>
+      <w:r>
+        <w:rPr>
+          <w:lang w:val="de-DE"/>
+        </w:rPr>
+        <w:t xml:space="preserve"> </w:t>
+      </w:r>
+      <w:proofErr w:type="spellStart"/>
+      <w:r>
+        <w:rPr>
+          <w:lang w:val="de-DE"/>
+        </w:rPr>
+        <w:t>dlho</w:t>
+      </w:r>
+      <w:proofErr w:type="spellEnd"/>
+      <w:r>
+        <w:rPr>
+          <w:lang w:val="de-DE"/>
+        </w:rPr>
+        <w:t xml:space="preserve"> </w:t>
+      </w:r>
+      <w:proofErr w:type="spellStart"/>
+      <w:r>
+        <w:rPr>
+          <w:lang w:val="de-DE"/>
+        </w:rPr>
+        <w:t>musis</w:t>
+      </w:r>
+      <w:proofErr w:type="spellEnd"/>
+      <w:r>
+        <w:rPr>
+          <w:lang w:val="de-DE"/>
+        </w:rPr>
+        <w:t xml:space="preserve"> v </w:t>
+      </w:r>
+      <w:proofErr w:type="spellStart"/>
+      <w:r>
+        <w:rPr>
+          <w:lang w:val="de-DE"/>
+        </w:rPr>
+        <w:t>piatok</w:t>
+      </w:r>
+      <w:proofErr w:type="spellEnd"/>
+      <w:r>
+        <w:rPr>
+          <w:lang w:val="de-DE"/>
+        </w:rPr>
+        <w:t xml:space="preserve"> </w:t>
+      </w:r>
+      <w:proofErr w:type="spellStart"/>
+      <w:r>
+        <w:rPr>
+          <w:lang w:val="de-DE"/>
+        </w:rPr>
+        <w:t>pracovat</w:t>
+      </w:r>
+      <w:proofErr w:type="spellEnd"/>
+      <w:r>
+        <w:rPr>
+          <w:lang w:val="de-DE"/>
+        </w:rPr>
+        <w:t xml:space="preserve"> – Wie lange musst du am Freitag arbeiten.</w:t>
       </w:r>
     </w:p>
     <w:p>
@@ -257,96 +778,104 @@
         <w:rPr>
           <w:lang w:val="de-DE"/>
         </w:rPr>
-        <w:t xml:space="preserve">Chcel by </w:t>
-      </w:r>
-      <w:proofErr w:type="spellStart"/>
-      <w:r>
-        <w:rPr>
-          <w:lang w:val="de-DE"/>
-        </w:rPr>
-        <w:t>som</w:t>
-      </w:r>
-      <w:proofErr w:type="spellEnd"/>
-      <w:r>
-        <w:rPr>
-          <w:lang w:val="de-DE"/>
-        </w:rPr>
-        <w:t xml:space="preserve"> </w:t>
-      </w:r>
-      <w:proofErr w:type="spellStart"/>
-      <w:r>
-        <w:rPr>
-          <w:lang w:val="de-DE"/>
-        </w:rPr>
-        <w:t>sa</w:t>
-      </w:r>
-      <w:proofErr w:type="spellEnd"/>
-      <w:r>
-        <w:rPr>
-          <w:lang w:val="de-DE"/>
-        </w:rPr>
-        <w:t xml:space="preserve"> </w:t>
-      </w:r>
-      <w:proofErr w:type="spellStart"/>
-      <w:r>
-        <w:rPr>
-          <w:lang w:val="de-DE"/>
-        </w:rPr>
-        <w:t>opytat</w:t>
-      </w:r>
-      <w:proofErr w:type="spellEnd"/>
-      <w:r>
-        <w:rPr>
-          <w:lang w:val="de-DE"/>
-        </w:rPr>
-        <w:t xml:space="preserve"> – ich m</w:t>
-      </w:r>
-      <w:r>
-        <w:rPr>
-          <w:lang w:val="de-DE"/>
-        </w:rPr>
-        <w:t>öchte fragen.</w:t>
+        <w:t>DU</w:t>
       </w:r>
     </w:p>
     <w:p>
       <w:pPr>
         <w:rPr>
-          <w:lang w:val="de-DE"/>
+          <w:lang w:val="sk-SK"/>
         </w:rPr>
       </w:pPr>
-      <w:proofErr w:type="spellStart"/>
-      <w:r>
-        <w:rPr>
-          <w:lang w:val="de-DE"/>
-        </w:rPr>
-        <w:t>Musis</w:t>
-      </w:r>
-      <w:proofErr w:type="spellEnd"/>
-      <w:r>
-        <w:rPr>
-          <w:lang w:val="de-DE"/>
-        </w:rPr>
-        <w:t xml:space="preserve"> mi </w:t>
-      </w:r>
-      <w:proofErr w:type="spellStart"/>
-      <w:r>
-        <w:rPr>
-          <w:lang w:val="de-DE"/>
-        </w:rPr>
-        <w:t>odpovedat</w:t>
-      </w:r>
-      <w:proofErr w:type="spellEnd"/>
-      <w:r>
-        <w:rPr>
-          <w:lang w:val="de-DE"/>
-        </w:rPr>
-        <w:t xml:space="preserve"> – </w:t>
-      </w:r>
-      <w:r>
-        <w:rPr>
-          <w:lang w:val="de-DE"/>
-        </w:rPr>
-        <w:t>Du musst mir antworten.</w:t>
+      <w:r>
+        <w:rPr>
+          <w:lang w:val="de-DE"/>
+        </w:rPr>
+        <w:t xml:space="preserve">Kedy </w:t>
+      </w:r>
+      <w:proofErr w:type="spellStart"/>
+      <w:r>
+        <w:rPr>
+          <w:lang w:val="de-DE"/>
+        </w:rPr>
+        <w:t>mate</w:t>
+      </w:r>
+      <w:proofErr w:type="spellEnd"/>
+      <w:r>
+        <w:rPr>
+          <w:lang w:val="de-DE"/>
+        </w:rPr>
+        <w:t xml:space="preserve"> </w:t>
+      </w:r>
+      <w:proofErr w:type="spellStart"/>
+      <w:r>
+        <w:rPr>
+          <w:lang w:val="de-DE"/>
+        </w:rPr>
+        <w:t>zacat</w:t>
+      </w:r>
+      <w:proofErr w:type="spellEnd"/>
+      <w:r>
+        <w:rPr>
+          <w:lang w:val="sk-SK"/>
+        </w:rPr>
+        <w:t xml:space="preserve">? – </w:t>
+      </w:r>
+      <w:proofErr w:type="spellStart"/>
+      <w:r>
+        <w:rPr>
+          <w:lang w:val="sk-SK"/>
+        </w:rPr>
+        <w:t>Wann</w:t>
+      </w:r>
+      <w:proofErr w:type="spellEnd"/>
+      <w:r>
+        <w:rPr>
+          <w:lang w:val="sk-SK"/>
+        </w:rPr>
+        <w:t xml:space="preserve"> </w:t>
+      </w:r>
+      <w:proofErr w:type="spellStart"/>
+      <w:r>
+        <w:rPr>
+          <w:lang w:val="sk-SK"/>
+        </w:rPr>
+        <w:t>sollt</w:t>
+      </w:r>
+      <w:proofErr w:type="spellEnd"/>
+      <w:r>
+        <w:rPr>
+          <w:lang w:val="sk-SK"/>
+        </w:rPr>
+        <w:t xml:space="preserve"> </w:t>
+      </w:r>
+      <w:proofErr w:type="spellStart"/>
+      <w:r>
+        <w:rPr>
+          <w:lang w:val="sk-SK"/>
+        </w:rPr>
+        <w:t>ihr</w:t>
+      </w:r>
+      <w:proofErr w:type="spellEnd"/>
+      <w:r>
+        <w:rPr>
+          <w:lang w:val="sk-SK"/>
+        </w:rPr>
+        <w:t xml:space="preserve"> </w:t>
+      </w:r>
+      <w:proofErr w:type="spellStart"/>
+      <w:r>
+        <w:rPr>
+          <w:lang w:val="sk-SK"/>
+        </w:rPr>
+        <w:t>beginnen</w:t>
+      </w:r>
+      <w:proofErr w:type="spellEnd"/>
+      <w:r>
+        <w:rPr>
+          <w:lang w:val="sk-SK"/>
+        </w:rPr>
+        <w:t>?</w:t>
       </w:r>
     </w:p>
     <w:p>
@@ -355,70 +884,68 @@
           <w:lang w:val="sk-SK"/>
         </w:rPr>
       </w:pPr>
-      <w:r>
-        <w:rPr>
-          <w:lang w:val="de-DE"/>
-        </w:rPr>
-        <w:t>Ma</w:t>
-      </w:r>
-      <w:r>
-        <w:rPr>
-          <w:lang w:val="de-DE"/>
-        </w:rPr>
-        <w:t xml:space="preserve">s </w:t>
-      </w:r>
-      <w:proofErr w:type="spellStart"/>
-      <w:r>
-        <w:rPr>
-          <w:lang w:val="de-DE"/>
-        </w:rPr>
-        <w:t>in</w:t>
-      </w:r>
-      <w:r>
-        <w:rPr>
-          <w:lang w:val="de-DE"/>
-        </w:rPr>
-        <w:t>formovat</w:t>
-      </w:r>
-      <w:proofErr w:type="spellEnd"/>
-      <w:r>
-        <w:rPr>
-          <w:lang w:val="de-DE"/>
-        </w:rPr>
-        <w:t xml:space="preserve"> o </w:t>
-      </w:r>
-      <w:proofErr w:type="spellStart"/>
-      <w:r>
-        <w:rPr>
-          <w:lang w:val="de-DE"/>
-        </w:rPr>
-        <w:t>konferencii</w:t>
-      </w:r>
-      <w:proofErr w:type="spellEnd"/>
-      <w:r>
-        <w:rPr>
-          <w:lang w:val="sk-SK"/>
-        </w:rPr>
-        <w:t xml:space="preserve">? </w:t>
-      </w:r>
-      <w:r>
-        <w:rPr>
-          <w:lang w:val="sk-SK"/>
-        </w:rPr>
-        <w:t>–</w:t>
-      </w:r>
-      <w:r>
-        <w:rPr>
-          <w:lang w:val="sk-SK"/>
-        </w:rPr>
-        <w:t xml:space="preserve"> </w:t>
-      </w:r>
-      <w:proofErr w:type="spellStart"/>
-      <w:r>
-        <w:rPr>
-          <w:lang w:val="sk-SK"/>
-        </w:rPr>
-        <w:t>Sollst</w:t>
+      <w:proofErr w:type="spellStart"/>
+      <w:r>
+        <w:rPr>
+          <w:lang w:val="sk-SK"/>
+        </w:rPr>
+        <w:t>Mozete</w:t>
+      </w:r>
+      <w:proofErr w:type="spellEnd"/>
+      <w:r>
+        <w:rPr>
+          <w:lang w:val="sk-SK"/>
+        </w:rPr>
+        <w:t xml:space="preserve"> mi </w:t>
+      </w:r>
+      <w:proofErr w:type="spellStart"/>
+      <w:r>
+        <w:rPr>
+          <w:lang w:val="sk-SK"/>
+        </w:rPr>
+        <w:t>vyplnit</w:t>
+      </w:r>
+      <w:proofErr w:type="spellEnd"/>
+      <w:r>
+        <w:rPr>
+          <w:lang w:val="sk-SK"/>
+        </w:rPr>
+        <w:t xml:space="preserve"> </w:t>
+      </w:r>
+      <w:proofErr w:type="spellStart"/>
+      <w:r>
+        <w:rPr>
+          <w:lang w:val="sk-SK"/>
+        </w:rPr>
+        <w:t>formular</w:t>
+      </w:r>
+      <w:proofErr w:type="spellEnd"/>
+      <w:r>
+        <w:rPr>
+          <w:lang w:val="sk-SK"/>
+        </w:rPr>
+        <w:t xml:space="preserve"> (</w:t>
+      </w:r>
+      <w:proofErr w:type="spellStart"/>
+      <w:r>
+        <w:rPr>
+          <w:lang w:val="sk-SK"/>
+        </w:rPr>
+        <w:t>ausfullen</w:t>
+      </w:r>
+      <w:proofErr w:type="spellEnd"/>
+      <w:r>
+        <w:rPr>
+          <w:lang w:val="sk-SK"/>
+        </w:rPr>
+        <w:t xml:space="preserve">) – </w:t>
+      </w:r>
+      <w:proofErr w:type="spellStart"/>
+      <w:r>
+        <w:rPr>
+          <w:lang w:val="sk-SK"/>
+        </w:rPr>
+        <w:t>kannst</w:t>
       </w:r>
       <w:proofErr w:type="spellEnd"/>
       <w:r>
@@ -446,49 +973,35 @@
         <w:rPr>
           <w:lang w:val="sk-SK"/>
         </w:rPr>
-        <w:t>über</w:t>
-      </w:r>
-      <w:proofErr w:type="spellEnd"/>
-      <w:r>
-        <w:rPr>
-          <w:lang w:val="sk-SK"/>
-        </w:rPr>
-        <w:t xml:space="preserve"> </w:t>
-      </w:r>
-      <w:proofErr w:type="spellStart"/>
-      <w:r>
-        <w:rPr>
-          <w:lang w:val="sk-SK"/>
-        </w:rPr>
-        <w:t>die</w:t>
-      </w:r>
-      <w:proofErr w:type="spellEnd"/>
-      <w:r>
-        <w:rPr>
-          <w:lang w:val="sk-SK"/>
-        </w:rPr>
-        <w:t xml:space="preserve"> </w:t>
-      </w:r>
-      <w:proofErr w:type="spellStart"/>
-      <w:r>
-        <w:rPr>
-          <w:lang w:val="sk-SK"/>
-        </w:rPr>
-        <w:t>konferenz</w:t>
-      </w:r>
-      <w:proofErr w:type="spellEnd"/>
-      <w:r>
-        <w:rPr>
-          <w:lang w:val="sk-SK"/>
-        </w:rPr>
-        <w:t xml:space="preserve"> </w:t>
-      </w:r>
-      <w:proofErr w:type="spellStart"/>
-      <w:r>
-        <w:rPr>
-          <w:lang w:val="sk-SK"/>
-        </w:rPr>
-        <w:t>berichten</w:t>
+        <w:t>ein</w:t>
+      </w:r>
+      <w:proofErr w:type="spellEnd"/>
+      <w:r>
+        <w:rPr>
+          <w:lang w:val="sk-SK"/>
+        </w:rPr>
+        <w:t xml:space="preserve"> </w:t>
+      </w:r>
+      <w:proofErr w:type="spellStart"/>
+      <w:r>
+        <w:rPr>
+          <w:lang w:val="sk-SK"/>
+        </w:rPr>
+        <w:t>formular</w:t>
+      </w:r>
+      <w:proofErr w:type="spellEnd"/>
+      <w:r>
+        <w:rPr>
+          <w:lang w:val="sk-SK"/>
+        </w:rPr>
+        <w:t xml:space="preserve"> </w:t>
+      </w:r>
+      <w:proofErr w:type="spellStart"/>
+      <w:r>
+        <w:rPr>
+          <w:lang w:val="sk-SK"/>
+        </w:rPr>
+        <w:t>ausfullen</w:t>
       </w:r>
       <w:proofErr w:type="spellEnd"/>
       <w:r>
@@ -504,481 +1017,316 @@
           <w:lang w:val="sk-SK"/>
         </w:rPr>
       </w:pPr>
-      <w:r>
-        <w:rPr>
-          <w:lang w:val="sk-SK"/>
-        </w:rPr>
-        <w:t xml:space="preserve">Zajtra </w:t>
-      </w:r>
-      <w:proofErr w:type="spellStart"/>
-      <w:r>
-        <w:rPr>
-          <w:lang w:val="sk-SK"/>
-        </w:rPr>
-        <w:t>musime</w:t>
-      </w:r>
-      <w:proofErr w:type="spellEnd"/>
-      <w:r>
-        <w:rPr>
-          <w:lang w:val="sk-SK"/>
-        </w:rPr>
-        <w:t xml:space="preserve"> </w:t>
-      </w:r>
-      <w:proofErr w:type="spellStart"/>
-      <w:r>
-        <w:rPr>
-          <w:lang w:val="sk-SK"/>
-        </w:rPr>
-        <w:t>ist</w:t>
-      </w:r>
-      <w:proofErr w:type="spellEnd"/>
-      <w:r>
-        <w:rPr>
-          <w:lang w:val="sk-SK"/>
-        </w:rPr>
-        <w:t xml:space="preserve"> do firmy – </w:t>
-      </w:r>
-      <w:proofErr w:type="spellStart"/>
-      <w:r>
-        <w:rPr>
-          <w:lang w:val="sk-SK"/>
-        </w:rPr>
-        <w:t>Morgen</w:t>
-      </w:r>
-      <w:proofErr w:type="spellEnd"/>
-      <w:r>
-        <w:rPr>
-          <w:lang w:val="sk-SK"/>
-        </w:rPr>
-        <w:t xml:space="preserve"> </w:t>
-      </w:r>
-      <w:proofErr w:type="spellStart"/>
-      <w:r>
-        <w:rPr>
-          <w:lang w:val="sk-SK"/>
-        </w:rPr>
-        <w:t>müssen</w:t>
-      </w:r>
-      <w:proofErr w:type="spellEnd"/>
-      <w:r>
-        <w:rPr>
-          <w:lang w:val="sk-SK"/>
-        </w:rPr>
-        <w:t xml:space="preserve"> </w:t>
-      </w:r>
-      <w:proofErr w:type="spellStart"/>
-      <w:r>
-        <w:rPr>
-          <w:lang w:val="sk-SK"/>
-        </w:rPr>
-        <w:t>Wir</w:t>
-      </w:r>
-      <w:proofErr w:type="spellEnd"/>
-      <w:r>
-        <w:rPr>
-          <w:lang w:val="sk-SK"/>
-        </w:rPr>
-        <w:t xml:space="preserve"> in </w:t>
-      </w:r>
-      <w:proofErr w:type="spellStart"/>
-      <w:r>
-        <w:rPr>
-          <w:lang w:val="sk-SK"/>
-        </w:rPr>
-        <w:t>die</w:t>
-      </w:r>
-      <w:proofErr w:type="spellEnd"/>
-      <w:r>
-        <w:rPr>
-          <w:lang w:val="sk-SK"/>
-        </w:rPr>
-        <w:t xml:space="preserve"> Firma </w:t>
-      </w:r>
-      <w:proofErr w:type="spellStart"/>
-      <w:r>
-        <w:rPr>
-          <w:lang w:val="sk-SK"/>
-        </w:rPr>
-        <w:t>gehen</w:t>
-      </w:r>
-      <w:proofErr w:type="spellEnd"/>
-      <w:r>
-        <w:rPr>
-          <w:lang w:val="sk-SK"/>
-        </w:rPr>
-        <w:t>.</w:t>
-      </w:r>
+      <w:proofErr w:type="spellStart"/>
+      <w:r>
+        <w:rPr>
+          <w:lang w:val="sk-SK"/>
+        </w:rPr>
+        <w:t>Musim</w:t>
+      </w:r>
+      <w:proofErr w:type="spellEnd"/>
+      <w:r>
+        <w:rPr>
+          <w:lang w:val="sk-SK"/>
+        </w:rPr>
+        <w:t xml:space="preserve"> telefonovať – </w:t>
+      </w:r>
+      <w:r>
+        <w:rPr>
+          <w:lang w:val="sk-SK"/>
+        </w:rPr>
+        <w:t xml:space="preserve">ich </w:t>
+      </w:r>
+      <w:proofErr w:type="spellStart"/>
+      <w:r>
+        <w:rPr>
+          <w:lang w:val="sk-SK"/>
+        </w:rPr>
+        <w:t>muss</w:t>
+      </w:r>
+      <w:proofErr w:type="spellEnd"/>
+      <w:r>
+        <w:rPr>
+          <w:lang w:val="sk-SK"/>
+        </w:rPr>
+        <w:t xml:space="preserve"> </w:t>
+      </w:r>
+      <w:proofErr w:type="spellStart"/>
+      <w:r>
+        <w:rPr>
+          <w:lang w:val="sk-SK"/>
+        </w:rPr>
+        <w:t>telefonieren</w:t>
+      </w:r>
+      <w:proofErr w:type="spellEnd"/>
     </w:p>
     <w:p>
       <w:pPr>
         <w:rPr>
-          <w:color w:val="4EA72E" w:themeColor="accent6"/>
           <w:lang w:val="sk-SK"/>
         </w:rPr>
       </w:pPr>
-      <w:proofErr w:type="spellStart"/>
-      <w:r>
-        <w:rPr>
-          <w:color w:val="4EA72E" w:themeColor="accent6"/>
-          <w:lang w:val="sk-SK"/>
-        </w:rPr>
-        <w:t>Morgen</w:t>
-      </w:r>
-      <w:proofErr w:type="spellEnd"/>
-      <w:r>
-        <w:rPr>
-          <w:color w:val="4EA72E" w:themeColor="accent6"/>
-          <w:lang w:val="sk-SK"/>
-        </w:rPr>
-        <w:t xml:space="preserve"> – zajtra, der </w:t>
-      </w:r>
-      <w:proofErr w:type="spellStart"/>
-      <w:r>
-        <w:rPr>
-          <w:color w:val="4EA72E" w:themeColor="accent6"/>
-          <w:lang w:val="sk-SK"/>
-        </w:rPr>
-        <w:t>Morgen</w:t>
-      </w:r>
-      <w:proofErr w:type="spellEnd"/>
-      <w:r>
-        <w:rPr>
-          <w:color w:val="4EA72E" w:themeColor="accent6"/>
-          <w:lang w:val="sk-SK"/>
-        </w:rPr>
-        <w:t xml:space="preserve"> – </w:t>
-      </w:r>
-      <w:proofErr w:type="spellStart"/>
-      <w:r>
-        <w:rPr>
-          <w:color w:val="4EA72E" w:themeColor="accent6"/>
-          <w:lang w:val="sk-SK"/>
-        </w:rPr>
-        <w:t>rano</w:t>
-      </w:r>
-      <w:proofErr w:type="spellEnd"/>
-      <w:r>
-        <w:rPr>
-          <w:color w:val="4EA72E" w:themeColor="accent6"/>
-          <w:lang w:val="sk-SK"/>
-        </w:rPr>
-        <w:tab/>
-      </w:r>
-      <w:r>
-        <w:rPr>
-          <w:color w:val="4EA72E" w:themeColor="accent6"/>
-          <w:lang w:val="sk-SK"/>
-        </w:rPr>
-        <w:tab/>
-        <w:t xml:space="preserve">zajtra </w:t>
-      </w:r>
-      <w:proofErr w:type="spellStart"/>
-      <w:r>
-        <w:rPr>
-          <w:color w:val="4EA72E" w:themeColor="accent6"/>
-          <w:lang w:val="sk-SK"/>
-        </w:rPr>
-        <w:t>rano</w:t>
-      </w:r>
-      <w:proofErr w:type="spellEnd"/>
-      <w:r>
-        <w:rPr>
-          <w:color w:val="4EA72E" w:themeColor="accent6"/>
-          <w:lang w:val="sk-SK"/>
-        </w:rPr>
-        <w:t xml:space="preserve"> je </w:t>
-      </w:r>
-      <w:proofErr w:type="spellStart"/>
-      <w:r>
-        <w:rPr>
-          <w:color w:val="4EA72E" w:themeColor="accent6"/>
-          <w:lang w:val="sk-SK"/>
-        </w:rPr>
-        <w:t>morgen</w:t>
-      </w:r>
-      <w:proofErr w:type="spellEnd"/>
-      <w:r>
-        <w:rPr>
-          <w:color w:val="4EA72E" w:themeColor="accent6"/>
-          <w:lang w:val="sk-SK"/>
-        </w:rPr>
-        <w:t xml:space="preserve"> </w:t>
-      </w:r>
-      <w:proofErr w:type="spellStart"/>
-      <w:r>
-        <w:rPr>
-          <w:color w:val="4EA72E" w:themeColor="accent6"/>
-          <w:lang w:val="sk-SK"/>
-        </w:rPr>
-        <w:t>früh</w:t>
-      </w:r>
-      <w:proofErr w:type="spellEnd"/>
+      <w:r>
+        <w:rPr>
+          <w:lang w:val="sk-SK"/>
+        </w:rPr>
+        <w:t>Kedy má kurz začať</w:t>
+      </w:r>
+      <w:r>
+        <w:rPr>
+          <w:lang w:val="sk-SK"/>
+        </w:rPr>
+        <w:t xml:space="preserve">? – </w:t>
+      </w:r>
+      <w:proofErr w:type="spellStart"/>
+      <w:r>
+        <w:rPr>
+          <w:lang w:val="sk-SK"/>
+        </w:rPr>
+        <w:t>Wann</w:t>
+      </w:r>
+      <w:proofErr w:type="spellEnd"/>
+      <w:r>
+        <w:rPr>
+          <w:lang w:val="sk-SK"/>
+        </w:rPr>
+        <w:t xml:space="preserve"> </w:t>
+      </w:r>
+      <w:proofErr w:type="spellStart"/>
+      <w:r>
+        <w:rPr>
+          <w:lang w:val="sk-SK"/>
+        </w:rPr>
+        <w:t>soll</w:t>
+      </w:r>
+      <w:proofErr w:type="spellEnd"/>
+      <w:r>
+        <w:rPr>
+          <w:lang w:val="sk-SK"/>
+        </w:rPr>
+        <w:t xml:space="preserve"> </w:t>
+      </w:r>
+      <w:proofErr w:type="spellStart"/>
+      <w:r>
+        <w:rPr>
+          <w:lang w:val="sk-SK"/>
+        </w:rPr>
+        <w:t>die</w:t>
+      </w:r>
+      <w:proofErr w:type="spellEnd"/>
+      <w:r>
+        <w:rPr>
+          <w:lang w:val="sk-SK"/>
+        </w:rPr>
+        <w:t xml:space="preserve"> kurz </w:t>
+      </w:r>
+      <w:proofErr w:type="spellStart"/>
+      <w:r>
+        <w:rPr>
+          <w:lang w:val="sk-SK"/>
+        </w:rPr>
+        <w:t>beginnen</w:t>
+      </w:r>
+      <w:proofErr w:type="spellEnd"/>
+      <w:r>
+        <w:rPr>
+          <w:lang w:val="sk-SK"/>
+        </w:rPr>
+        <w:t>?</w:t>
+      </w:r>
     </w:p>
     <w:p>
       <w:pPr>
         <w:rPr>
-          <w:lang w:val="de-DE"/>
+          <w:lang w:val="sk-SK"/>
         </w:rPr>
       </w:pPr>
-      <w:proofErr w:type="spellStart"/>
-      <w:r>
-        <w:rPr>
-          <w:lang w:val="de-DE"/>
-        </w:rPr>
-        <w:t>Ako</w:t>
-      </w:r>
-      <w:proofErr w:type="spellEnd"/>
-      <w:r>
-        <w:rPr>
-          <w:lang w:val="de-DE"/>
-        </w:rPr>
-        <w:t xml:space="preserve"> </w:t>
-      </w:r>
-      <w:proofErr w:type="spellStart"/>
-      <w:r>
-        <w:rPr>
-          <w:lang w:val="de-DE"/>
-        </w:rPr>
-        <w:t>dlho</w:t>
-      </w:r>
-      <w:proofErr w:type="spellEnd"/>
-      <w:r>
-        <w:rPr>
-          <w:lang w:val="de-DE"/>
-        </w:rPr>
-        <w:t xml:space="preserve"> </w:t>
-      </w:r>
-      <w:proofErr w:type="spellStart"/>
-      <w:r>
-        <w:rPr>
-          <w:lang w:val="de-DE"/>
-        </w:rPr>
-        <w:t>musis</w:t>
-      </w:r>
-      <w:proofErr w:type="spellEnd"/>
-      <w:r>
-        <w:rPr>
-          <w:lang w:val="de-DE"/>
-        </w:rPr>
-        <w:t xml:space="preserve"> v </w:t>
-      </w:r>
-      <w:proofErr w:type="spellStart"/>
-      <w:r>
-        <w:rPr>
-          <w:lang w:val="de-DE"/>
-        </w:rPr>
-        <w:t>piatok</w:t>
-      </w:r>
-      <w:proofErr w:type="spellEnd"/>
-      <w:r>
-        <w:rPr>
-          <w:lang w:val="de-DE"/>
-        </w:rPr>
-        <w:t xml:space="preserve"> </w:t>
-      </w:r>
-      <w:proofErr w:type="spellStart"/>
-      <w:r>
-        <w:rPr>
-          <w:lang w:val="de-DE"/>
-        </w:rPr>
-        <w:t>pracovat</w:t>
-      </w:r>
-      <w:proofErr w:type="spellEnd"/>
-      <w:r>
-        <w:rPr>
-          <w:lang w:val="de-DE"/>
-        </w:rPr>
-        <w:t xml:space="preserve"> – Wie lange musst du am Freitag arbeiten.</w:t>
+      <w:r>
+        <w:rPr>
+          <w:lang w:val="sk-SK"/>
+        </w:rPr>
+        <w:t xml:space="preserve">Kedy si môžeme urobiť prestávku na kávu? – </w:t>
+      </w:r>
+      <w:proofErr w:type="spellStart"/>
+      <w:r>
+        <w:rPr>
+          <w:lang w:val="sk-SK"/>
+        </w:rPr>
+        <w:t>wann</w:t>
+      </w:r>
+      <w:proofErr w:type="spellEnd"/>
+      <w:r>
+        <w:rPr>
+          <w:lang w:val="sk-SK"/>
+        </w:rPr>
+        <w:t xml:space="preserve"> </w:t>
+      </w:r>
+      <w:proofErr w:type="spellStart"/>
+      <w:r>
+        <w:rPr>
+          <w:lang w:val="sk-SK"/>
+        </w:rPr>
+        <w:t>darf</w:t>
+      </w:r>
+      <w:proofErr w:type="spellEnd"/>
+      <w:r>
+        <w:rPr>
+          <w:lang w:val="sk-SK"/>
+        </w:rPr>
+        <w:t xml:space="preserve"> ich </w:t>
+      </w:r>
+      <w:proofErr w:type="spellStart"/>
+      <w:r>
+        <w:rPr>
+          <w:lang w:val="sk-SK"/>
+        </w:rPr>
+        <w:t>eine</w:t>
+      </w:r>
+      <w:proofErr w:type="spellEnd"/>
+      <w:r>
+        <w:rPr>
+          <w:lang w:val="sk-SK"/>
+        </w:rPr>
+        <w:t xml:space="preserve"> </w:t>
+      </w:r>
+      <w:proofErr w:type="spellStart"/>
+      <w:r>
+        <w:rPr>
+          <w:lang w:val="sk-SK"/>
+        </w:rPr>
+        <w:t>pause</w:t>
+      </w:r>
+      <w:proofErr w:type="spellEnd"/>
+      <w:r>
+        <w:rPr>
+          <w:lang w:val="sk-SK"/>
+        </w:rPr>
+        <w:t xml:space="preserve"> </w:t>
+      </w:r>
+      <w:proofErr w:type="spellStart"/>
+      <w:r>
+        <w:rPr>
+          <w:lang w:val="sk-SK"/>
+        </w:rPr>
+        <w:t>fur</w:t>
+      </w:r>
+      <w:proofErr w:type="spellEnd"/>
+      <w:r>
+        <w:rPr>
+          <w:lang w:val="sk-SK"/>
+        </w:rPr>
+        <w:t xml:space="preserve"> </w:t>
+      </w:r>
+      <w:proofErr w:type="spellStart"/>
+      <w:r>
+        <w:rPr>
+          <w:lang w:val="sk-SK"/>
+        </w:rPr>
+        <w:t>koffee</w:t>
+      </w:r>
+      <w:proofErr w:type="spellEnd"/>
+      <w:r>
+        <w:rPr>
+          <w:lang w:val="sk-SK"/>
+        </w:rPr>
+        <w:t xml:space="preserve"> </w:t>
+      </w:r>
+      <w:proofErr w:type="spellStart"/>
+      <w:r>
+        <w:rPr>
+          <w:lang w:val="sk-SK"/>
+        </w:rPr>
+        <w:t>haben</w:t>
+      </w:r>
+      <w:proofErr w:type="spellEnd"/>
+      <w:r>
+        <w:rPr>
+          <w:lang w:val="sk-SK"/>
+        </w:rPr>
+        <w:t>.</w:t>
       </w:r>
     </w:p>
     <w:p>
       <w:pPr>
         <w:rPr>
-          <w:lang w:val="de-DE"/>
+          <w:lang w:val="sk-SK"/>
         </w:rPr>
       </w:pPr>
-    </w:p>
-    <w:p>
-      <w:pPr>
-        <w:rPr>
-          <w:lang w:val="de-DE"/>
-        </w:rPr>
-      </w:pPr>
-      <w:r>
-        <w:rPr>
-          <w:lang w:val="de-DE"/>
-        </w:rPr>
-        <w:t>DU</w:t>
-      </w:r>
-    </w:p>
-    <w:p>
-      <w:pPr>
-        <w:rPr>
-          <w:lang w:val="sk-SK"/>
-        </w:rPr>
-      </w:pPr>
-      <w:r>
-        <w:rPr>
-          <w:lang w:val="de-DE"/>
-        </w:rPr>
-        <w:t xml:space="preserve">Kedy </w:t>
-      </w:r>
-      <w:proofErr w:type="spellStart"/>
-      <w:r>
-        <w:rPr>
-          <w:lang w:val="de-DE"/>
-        </w:rPr>
-        <w:t>mate</w:t>
-      </w:r>
-      <w:proofErr w:type="spellEnd"/>
-      <w:r>
-        <w:rPr>
-          <w:lang w:val="de-DE"/>
-        </w:rPr>
-        <w:t xml:space="preserve"> </w:t>
-      </w:r>
-      <w:proofErr w:type="spellStart"/>
-      <w:r>
-        <w:rPr>
-          <w:lang w:val="de-DE"/>
-        </w:rPr>
-        <w:t>zacat</w:t>
-      </w:r>
-      <w:proofErr w:type="spellEnd"/>
-      <w:r>
-        <w:rPr>
-          <w:lang w:val="sk-SK"/>
-        </w:rPr>
-        <w:t xml:space="preserve">? – </w:t>
-      </w:r>
-    </w:p>
-    <w:p>
-      <w:pPr>
-        <w:rPr>
-          <w:lang w:val="sk-SK"/>
-        </w:rPr>
-      </w:pPr>
-      <w:proofErr w:type="spellStart"/>
-      <w:r>
-        <w:rPr>
-          <w:lang w:val="sk-SK"/>
-        </w:rPr>
-        <w:t>Mozete</w:t>
-      </w:r>
-      <w:proofErr w:type="spellEnd"/>
-      <w:r>
-        <w:rPr>
-          <w:lang w:val="sk-SK"/>
-        </w:rPr>
-        <w:t xml:space="preserve"> mi </w:t>
-      </w:r>
-      <w:proofErr w:type="spellStart"/>
-      <w:r>
-        <w:rPr>
-          <w:lang w:val="sk-SK"/>
-        </w:rPr>
-        <w:t>vyplnit</w:t>
-      </w:r>
-      <w:proofErr w:type="spellEnd"/>
-      <w:r>
-        <w:rPr>
-          <w:lang w:val="sk-SK"/>
-        </w:rPr>
-        <w:t xml:space="preserve"> </w:t>
-      </w:r>
-      <w:proofErr w:type="spellStart"/>
-      <w:r>
-        <w:rPr>
-          <w:lang w:val="sk-SK"/>
-        </w:rPr>
-        <w:t>formular</w:t>
-      </w:r>
-      <w:proofErr w:type="spellEnd"/>
-      <w:r>
-        <w:rPr>
-          <w:lang w:val="sk-SK"/>
-        </w:rPr>
-        <w:t xml:space="preserve"> (</w:t>
-      </w:r>
-      <w:proofErr w:type="spellStart"/>
-      <w:r>
-        <w:rPr>
-          <w:lang w:val="sk-SK"/>
-        </w:rPr>
-        <w:t>ausfullen</w:t>
-      </w:r>
-      <w:proofErr w:type="spellEnd"/>
-      <w:r>
-        <w:rPr>
-          <w:lang w:val="sk-SK"/>
-        </w:rPr>
-        <w:t xml:space="preserve">) – </w:t>
-      </w:r>
-    </w:p>
-    <w:p>
-      <w:pPr>
-        <w:rPr>
-          <w:lang w:val="sk-SK"/>
-        </w:rPr>
-      </w:pPr>
-      <w:proofErr w:type="spellStart"/>
-      <w:r>
-        <w:rPr>
-          <w:lang w:val="sk-SK"/>
-        </w:rPr>
-        <w:t>Musim</w:t>
-      </w:r>
-      <w:proofErr w:type="spellEnd"/>
-      <w:r>
-        <w:rPr>
-          <w:lang w:val="sk-SK"/>
-        </w:rPr>
-        <w:t xml:space="preserve"> telefonovať – </w:t>
-      </w:r>
-    </w:p>
-    <w:p>
-      <w:pPr>
-        <w:rPr>
-          <w:lang w:val="sk-SK"/>
-        </w:rPr>
-      </w:pPr>
-      <w:r>
-        <w:rPr>
-          <w:lang w:val="sk-SK"/>
-        </w:rPr>
-        <w:t>Kedy má kurz začať</w:t>
-      </w:r>
-      <w:r>
-        <w:rPr>
-          <w:lang w:val="sk-SK"/>
-        </w:rPr>
-        <w:t xml:space="preserve">? – </w:t>
-      </w:r>
-    </w:p>
-    <w:p>
-      <w:pPr>
-        <w:rPr>
-          <w:lang w:val="sk-SK"/>
-        </w:rPr>
-      </w:pPr>
-      <w:r>
-        <w:rPr>
-          <w:lang w:val="sk-SK"/>
-        </w:rPr>
-        <w:t xml:space="preserve">Kedy si môžeme urobiť prestávku na kávu? – </w:t>
-      </w:r>
-    </w:p>
-    <w:p>
-      <w:pPr>
-        <w:rPr>
-          <w:lang w:val="sk-SK"/>
-        </w:rPr>
-      </w:pPr>
       <w:r>
         <w:rPr>
           <w:lang w:val="sk-SK"/>
         </w:rPr>
         <w:t xml:space="preserve">Koľko hodín týždenne musíš pracovať – </w:t>
+      </w:r>
+      <w:proofErr w:type="spellStart"/>
+      <w:r>
+        <w:rPr>
+          <w:lang w:val="sk-SK"/>
+        </w:rPr>
+        <w:t>Wie</w:t>
+      </w:r>
+      <w:proofErr w:type="spellEnd"/>
+      <w:r>
+        <w:rPr>
+          <w:lang w:val="sk-SK"/>
+        </w:rPr>
+        <w:t xml:space="preserve"> </w:t>
+      </w:r>
+      <w:proofErr w:type="spellStart"/>
+      <w:r>
+        <w:rPr>
+          <w:lang w:val="sk-SK"/>
+        </w:rPr>
+        <w:t>viel</w:t>
+      </w:r>
+      <w:proofErr w:type="spellEnd"/>
+      <w:r>
+        <w:rPr>
+          <w:lang w:val="sk-SK"/>
+        </w:rPr>
+        <w:t xml:space="preserve"> </w:t>
+      </w:r>
+      <w:proofErr w:type="spellStart"/>
+      <w:r>
+        <w:rPr>
+          <w:lang w:val="sk-SK"/>
+        </w:rPr>
+        <w:t>stunde</w:t>
+      </w:r>
+      <w:proofErr w:type="spellEnd"/>
+      <w:r>
+        <w:rPr>
+          <w:lang w:val="sk-SK"/>
+        </w:rPr>
+        <w:t xml:space="preserve"> </w:t>
+      </w:r>
+      <w:proofErr w:type="spellStart"/>
+      <w:r>
+        <w:rPr>
+          <w:lang w:val="sk-SK"/>
+        </w:rPr>
+        <w:t>musst</w:t>
+      </w:r>
+      <w:proofErr w:type="spellEnd"/>
+      <w:r>
+        <w:rPr>
+          <w:lang w:val="sk-SK"/>
+        </w:rPr>
+        <w:t xml:space="preserve"> </w:t>
+      </w:r>
+      <w:proofErr w:type="spellStart"/>
+      <w:r>
+        <w:rPr>
+          <w:lang w:val="sk-SK"/>
+        </w:rPr>
+        <w:t>du</w:t>
+      </w:r>
+      <w:proofErr w:type="spellEnd"/>
+      <w:r>
+        <w:rPr>
+          <w:lang w:val="sk-SK"/>
+        </w:rPr>
+        <w:t xml:space="preserve"> arbeiten?</w:t>
       </w:r>
     </w:p>
     <w:p>

</xml_diff>